<commit_message>
Marcar en redline las añadiduras a las determinaciones de REV2a
Los nueve incisos nuevos de la vista y la corrección del typo quedan en fuente roja; el inciso duplicado eliminado se restaura en rojo tachado para que la eliminación sea visible y revisable.

Co-Authored-By: Claude Fable 5 <noreply@anthropic.com>

Claude-Session: https://claude.ai/code/session_015XTf7YVNkr8YeGhk2dDMDw
</commit_message>
<xml_diff>
--- a/REV2a. Informe de Vista Informal Luis Vélez.docx
+++ b/REV2a. Informe de Vista Informal Luis Vélez.docx
@@ -3027,47 +3027,10 @@
           <w:sz w:val="24"/>
           <w:szCs w:val="24"/>
           <w:lang w:val="es-ES"/>
-        </w:rPr>
-        <w:t>En la vista administrativa informal celebrada el 28 de agosto de 2026, el empleado no aceptó la cesantía por incapacidad y solicitó que, en lugar de la cesantía, se le reubicara en otras funciones o puesto. Su planteamiento principal fue que se le asignaran funciones de conductor</w:t>
-      </w:r>
-      <w:r>
-        <w:rPr>
-          <w:rFonts w:ascii="Times New Roman" w:hAnsi="Times New Roman" w:cs="Times New Roman"/>
-          <w:sz w:val="24"/>
-          <w:szCs w:val="24"/>
-          <w:lang w:val="es-ES"/>
-        </w:rPr>
-        <w:t xml:space="preserve">, </w:t>
-      </w:r>
-      <w:r>
-        <w:rPr>
-          <w:rFonts w:ascii="Times New Roman" w:hAnsi="Times New Roman" w:cs="Times New Roman"/>
-          <w:sz w:val="24"/>
-          <w:szCs w:val="24"/>
-          <w:lang w:val="es-ES"/>
-        </w:rPr>
-        <w:t xml:space="preserve">conducir el tractor cortagrama y/o un vehículo liviano de motor (F-350 o Silverado) para transportar a sus compañeros a las áreas de trabajo y brindarles apoyo, por entender que puede desempeñarlas sentado y que las realizó durante cerca de cuatro (4) años. No obstante, el propio empleado admitió que no posee la licencia de conducir de </w:t>
-      </w:r>
-      <w:r>
-        <w:rPr>
-          <w:rFonts w:ascii="Times New Roman" w:hAnsi="Times New Roman" w:cs="Times New Roman"/>
-          <w:b/>
-          <w:bCs/>
-          <w:sz w:val="24"/>
-          <w:szCs w:val="24"/>
-          <w:highlight w:val="yellow"/>
-          <w:lang w:val="es-ES"/>
-        </w:rPr>
-        <w:t>categoría 4</w:t>
-      </w:r>
-      <w:r>
-        <w:rPr>
-          <w:rFonts w:ascii="Times New Roman" w:hAnsi="Times New Roman" w:cs="Times New Roman"/>
-          <w:sz w:val="24"/>
-          <w:szCs w:val="24"/>
-          <w:lang w:val="es-ES"/>
-        </w:rPr>
-        <w:t xml:space="preserve"> que exige el puesto de Conductor, por lo que no cualifica para ocupar dicho puesto.</w:t>
+          <w:color w:val="FF0000"/>
+          <w:strike/>
+        </w:rPr>
+        <w:t xml:space="preserve">El 28 de agosto de 2026 en la vista administrativa informal, el empleado no aceptó la cesantía por incapacidad y solicitó que, en lugar de la cesantía, se le concediera otras funciones o puesto. En su declaración insistió en que se le asignaran funciones de conductor (conducir el tractor cortagrama y/o un vehículo liviano de motor para transportar a sus compañeros a las áreas de trabajo y brindarles apoyo), por entender que puede desempeñarlas sentado y que las realizó durante cerca de cuatro (4) años. Esto a pesar de que no cumplía con el requisito de poseer una licencia de la categoría que requiere el puesto de conductor.  A punto seguido, el empleado aceptó que no posee la categoría 4 en su licencias para poder ocupar el puesto de Conductor.</w:t>
       </w:r>
     </w:p>
     <w:p>
@@ -3086,16 +3049,53 @@
           <w:lang w:val="es-ES"/>
         </w:rPr>
       </w:pPr>
-      <w:proofErr w:type="spellStart"/>
-      <w:proofErr w:type="spellEnd"/>
-      <w:r>
-        <w:rPr>
-          <w:rFonts w:ascii="Times New Roman" w:hAnsi="Times New Roman" w:cs="Times New Roman"/>
-          <w:sz w:val="24"/>
-          <w:szCs w:val="24"/>
-          <w:lang w:val="es-ES"/>
-        </w:rPr>
-        <w:t xml:space="preserve">Al atenderse el contenido de la carta de intención de cesantía, el empleado confirmó que la situación surgió cuando trabajaba con el “blower” y el “trimmer”. Explicó que tiene una condición previa en la pierna derecha, operada en el 2013, en la que tiene tornillos y varilla, y que se lastimó la espalda. Indicó que durante más de un año de trabajo no sentía dolor, y atribuyó el agravamiento de su condición al traslado de las brigadas de los parques hacia las carreteras municipales y estatales, luego de privatizarse el mantenimiento de los parques.</w:t>
+      <w:r>
+        <w:rPr>
+          <w:rFonts w:ascii="Times New Roman" w:hAnsi="Times New Roman" w:cs="Times New Roman"/>
+          <w:sz w:val="24"/>
+          <w:szCs w:val="24"/>
+          <w:lang w:val="es-ES"/>
+        </w:rPr>
+        <w:t>En la vista administrativa informal celebrada el 28 de agosto de 2026, el empleado no aceptó la cesantía por incapacidad y solicitó que, en lugar de la cesantía, se le reubicara en otras funciones o puesto. Su planteamiento principal fue que se le asignaran funciones de conductor</w:t>
+      </w:r>
+      <w:r>
+        <w:rPr>
+          <w:rFonts w:ascii="Times New Roman" w:hAnsi="Times New Roman" w:cs="Times New Roman"/>
+          <w:sz w:val="24"/>
+          <w:szCs w:val="24"/>
+          <w:lang w:val="es-ES"/>
+        </w:rPr>
+        <w:t xml:space="preserve">, </w:t>
+      </w:r>
+      <w:r>
+        <w:rPr>
+          <w:rFonts w:ascii="Times New Roman" w:hAnsi="Times New Roman" w:cs="Times New Roman"/>
+          <w:sz w:val="24"/>
+          <w:szCs w:val="24"/>
+          <w:lang w:val="es-ES"/>
+        </w:rPr>
+        <w:t xml:space="preserve">conducir el tractor cortagrama y/o un vehículo liviano de motor (F-350 o Silverado) para transportar a sus compañeros a las áreas de trabajo y brindarles apoyo, por entender que puede desempeñarlas sentado y que las realizó durante cerca de cuatro (4) años. No obstante, el propio empleado admitió que no posee la licencia de conducir de </w:t>
+      </w:r>
+      <w:r>
+        <w:rPr>
+          <w:rFonts w:ascii="Times New Roman" w:hAnsi="Times New Roman" w:cs="Times New Roman"/>
+          <w:b/>
+          <w:bCs/>
+          <w:sz w:val="24"/>
+          <w:szCs w:val="24"/>
+          <w:highlight w:val="yellow"/>
+          <w:lang w:val="es-ES"/>
+        </w:rPr>
+        <w:t>categoría 4</w:t>
+      </w:r>
+      <w:r>
+        <w:rPr>
+          <w:rFonts w:ascii="Times New Roman" w:hAnsi="Times New Roman" w:cs="Times New Roman"/>
+          <w:sz w:val="24"/>
+          <w:szCs w:val="24"/>
+          <w:lang w:val="es-ES"/>
+        </w:rPr>
+        <w:t xml:space="preserve"> que exige el puesto de Conductor, por lo que no cualifica para ocupar dicho puesto.</w:t>
       </w:r>
     </w:p>
     <w:p>
@@ -3122,8 +3122,9 @@
           <w:sz w:val="24"/>
           <w:szCs w:val="24"/>
           <w:lang w:val="es-ES"/>
-        </w:rPr>
-        <w:t xml:space="preserve">El empleado confirmó que, con anterioridad, el Municipio lo refirió a la Corporación del Fondo del Seguro del Estado (CFSE) por su condición de espalda; que estuvo en descanso alrededor de un (1) mes; que recibió inyecciones, medicamentos y terapias; y que fue dado de alta sin restricciones, reincorporándose a sus funciones regulares. Admitió que, ante recaídas posteriores, no regresó a la CFSE, sino que acudía al CDT del pueblo a inyectarse o a su médico primario, porque se le habían agotado los días por enfermedad y la CFSE no paga salario, al ser una reserva.</w:t>
+          <w:color w:val="FF0000"/>
+        </w:rPr>
+        <w:t xml:space="preserve">Al atenderse el contenido de la carta de intención de cesantía, el empleado confirmó que la situación surgió cuando trabajaba con el “blower” y el “trimmer”. Explicó que tiene una condición previa en la pierna derecha, operada en el 2013, en la que tiene tornillos y varilla, y que se lastimó la espalda. Indicó que durante más de un año de trabajo no sentía dolor, y atribuyó el agravamiento de su condición al traslado de las brigadas de los parques hacia las carreteras municipales y estatales, luego de privatizarse el mantenimiento de los parques.</w:t>
       </w:r>
     </w:p>
     <w:p>
@@ -3150,8 +3151,9 @@
           <w:sz w:val="24"/>
           <w:szCs w:val="24"/>
           <w:lang w:val="es-ES"/>
-        </w:rPr>
-        <w:t xml:space="preserve">Admitió, además, un patrón de ausencias de uno (1) o dos (2) días por dolores de espalda, que notificaba al supervisor, y que desde noviembre del año anterior le había expresado a la Directora de Recursos Humanos que no podía continuar realizando sus funciones, solicitando que se le trasladara a Obras Públicas, “aunque sea para escombro”.</w:t>
+          <w:color w:val="FF0000"/>
+        </w:rPr>
+        <w:t xml:space="preserve">El empleado confirmó que, con anterioridad, el Municipio lo refirió a la Corporación del Fondo del Seguro del Estado (CFSE) por su condición de espalda; que estuvo en descanso alrededor de un (1) mes; que recibió inyecciones, medicamentos y terapias; y que fue dado de alta sin restricciones, reincorporándose a sus funciones regulares. Admitió que, ante recaídas posteriores, no regresó a la CFSE, sino que acudía al CDT del pueblo a inyectarse o a su médico primario, porque se le habían agotado los días por enfermedad y la CFSE no paga salario, al ser una reserva.</w:t>
       </w:r>
     </w:p>
     <w:p>
@@ -3178,8 +3180,9 @@
           <w:sz w:val="24"/>
           <w:szCs w:val="24"/>
           <w:lang w:val="es-ES"/>
-        </w:rPr>
-        <w:t xml:space="preserve">Confirmó que la certificación de su médico primario fue expedida el 20 de julio de 2026 y que la entregó a la Oficina de Recursos Humanos ese mismo día, y reconoció la limitación de no poder cargar peso mayor de quince (15) libras que surge de la misma. Explicó que gestionó dicha certificación a instancias del supervisor interino, quien le pidió que trajera un papel de su médico para ver cómo podía ayudarlo.</w:t>
+          <w:color w:val="FF0000"/>
+        </w:rPr>
+        <w:t xml:space="preserve">Admitió, además, un patrón de ausencias de uno (1) o dos (2) días por dolores de espalda, que notificaba al supervisor, y que desde noviembre del año anterior le había expresado a la Directora de Recursos Humanos que no podía continuar realizando sus funciones, solicitando que se le trasladara a Obras Públicas, “aunque sea para escombro”.</w:t>
       </w:r>
     </w:p>
     <w:p>
@@ -3198,41 +3201,17 @@
           <w:lang w:val="es-ES"/>
         </w:rPr>
       </w:pPr>
-      <w:r>
-        <w:rPr>
-          <w:rFonts w:ascii="Times New Roman" w:hAnsi="Times New Roman" w:cs="Times New Roman"/>
-          <w:sz w:val="24"/>
-          <w:szCs w:val="24"/>
-          <w:lang w:val="es-ES"/>
-        </w:rPr>
-        <w:t>El empleado admitió que el Municipio le concedió un acomodo razonable</w:t>
-      </w:r>
-      <w:r>
-        <w:rPr>
-          <w:rFonts w:ascii="Times New Roman" w:hAnsi="Times New Roman" w:cs="Times New Roman"/>
-          <w:sz w:val="24"/>
-          <w:szCs w:val="24"/>
-          <w:lang w:val="es-ES"/>
-        </w:rPr>
-        <w:t>. A esos efectos,</w:t>
-      </w:r>
-      <w:r>
-        <w:rPr>
-          <w:rFonts w:ascii="Times New Roman" w:hAnsi="Times New Roman" w:cs="Times New Roman"/>
-          <w:sz w:val="24"/>
-          <w:szCs w:val="24"/>
-          <w:lang w:val="es-ES"/>
-        </w:rPr>
-        <w:t xml:space="preserve"> confirmó que, luego del 21 de julio de 2026, no volvió a utilizar el "blower" ni el "trimmer", y que dejó de utilizar dichas herramientas a instancias del Municipio como parte de dicho acomodo. Igualmente, admitió que el 3 de agosto de 2026 se negó a manejar el carretón ("dron") de recogido por razón de su condición médica</w:t>
-      </w:r>
-      <w:r>
-        <w:rPr>
-          <w:rFonts w:ascii="Times New Roman" w:hAnsi="Times New Roman" w:cs="Times New Roman"/>
-          <w:sz w:val="24"/>
-          <w:szCs w:val="24"/>
-          <w:lang w:val="es-ES"/>
-        </w:rPr>
-        <w:t xml:space="preserve"> y su supervisor lo instó a visitar el médico.</w:t>
+      <w:proofErr w:type="spellStart"/>
+      <w:proofErr w:type="spellEnd"/>
+      <w:r>
+        <w:rPr>
+          <w:rFonts w:ascii="Times New Roman" w:hAnsi="Times New Roman" w:cs="Times New Roman"/>
+          <w:sz w:val="24"/>
+          <w:szCs w:val="24"/>
+          <w:lang w:val="es-ES"/>
+          <w:color w:val="FF0000"/>
+        </w:rPr>
+        <w:t xml:space="preserve">Confirmó que la certificación de su médico primario fue expedida el 20 de julio de 2026 y que la entregó a la Oficina de Recursos Humanos ese mismo día, y reconoció la limitación de no poder cargar peso mayor de quince (15) libras que surge de la misma. Explicó que gestionó dicha certificación a instancias del supervisor interino, quien le pidió que trajera un papel de su médico para ver cómo podía ayudarlo.</w:t>
       </w:r>
     </w:p>
     <w:p>
@@ -3251,16 +3230,41 @@
           <w:lang w:val="es-ES"/>
         </w:rPr>
       </w:pPr>
-      <w:proofErr w:type="spellStart"/>
-      <w:proofErr w:type="spellEnd"/>
-      <w:r>
-        <w:rPr>
-          <w:rFonts w:ascii="Times New Roman" w:hAnsi="Times New Roman" w:cs="Times New Roman"/>
-          <w:sz w:val="24"/>
-          <w:szCs w:val="24"/>
-          <w:lang w:val="es-ES"/>
-        </w:rPr>
-        <w:t xml:space="preserve">En cuanto al alcance del acomodo concedido, el empleado puntualizó que la instrucción que recibió fue que Recursos Humanos hablaría con el supervisor interino para identificar dónde podía acomodarlo; que en ese momento se le mencionó el tractor y no el rastrillo; que el trabajo de tractor no era diario; y que, los días en que no había tractor, se le asignaba conducir la guagua para transportar a sus compañeros a las áreas de trabajo y escoltarlos en la vía, sin realizar tareas de carga.</w:t>
+      <w:r>
+        <w:rPr>
+          <w:rFonts w:ascii="Times New Roman" w:hAnsi="Times New Roman" w:cs="Times New Roman"/>
+          <w:sz w:val="24"/>
+          <w:szCs w:val="24"/>
+          <w:lang w:val="es-ES"/>
+        </w:rPr>
+        <w:t>El empleado admitió que el Municipio le concedió un acomodo razonable</w:t>
+      </w:r>
+      <w:r>
+        <w:rPr>
+          <w:rFonts w:ascii="Times New Roman" w:hAnsi="Times New Roman" w:cs="Times New Roman"/>
+          <w:sz w:val="24"/>
+          <w:szCs w:val="24"/>
+          <w:lang w:val="es-ES"/>
+        </w:rPr>
+        <w:t>. A esos efectos,</w:t>
+      </w:r>
+      <w:r>
+        <w:rPr>
+          <w:rFonts w:ascii="Times New Roman" w:hAnsi="Times New Roman" w:cs="Times New Roman"/>
+          <w:sz w:val="24"/>
+          <w:szCs w:val="24"/>
+          <w:lang w:val="es-ES"/>
+        </w:rPr>
+        <w:t xml:space="preserve"> confirmó que, luego del 21 de julio de 2026, no volvió a utilizar el "blower" ni el "trimmer", y que dejó de utilizar dichas herramientas a instancias del Municipio como parte de dicho acomodo. Igualmente, admitió que el 3 de agosto de 2026 se negó a manejar el carretón ("dron") de recogido por razón de su condición médica</w:t>
+      </w:r>
+      <w:r>
+        <w:rPr>
+          <w:rFonts w:ascii="Times New Roman" w:hAnsi="Times New Roman" w:cs="Times New Roman"/>
+          <w:sz w:val="24"/>
+          <w:szCs w:val="24"/>
+          <w:lang w:val="es-ES"/>
+        </w:rPr>
+        <w:t xml:space="preserve"> y su supervisor lo instó a visitar el médico.</w:t>
       </w:r>
     </w:p>
     <w:p>
@@ -3287,8 +3291,9 @@
           <w:sz w:val="24"/>
           <w:szCs w:val="24"/>
           <w:lang w:val="es-ES"/>
-        </w:rPr>
-        <w:t xml:space="preserve">Sobre los hechos del 3 de agosto de 2026, el empleado confirmó la secuencia de eventos: ese día faltó el compañero que ordinariamente utilizaba el carretón y había poco personal; el supervisor le instruyó tomar el rastrillo y el carretón (“dron”) para recoger basura; el empleado le manifestó que estaba lastimado y que había traído un papel del médico; fue conducido a Servicios Generales y citado a las 11:00 a.m. a la Oficina de Recursos Humanos donde, al planteársele que se estaba negando a trabajar, respondió que no se estaba negando a trabajar, sino que había traído una certificación médica con sus limitaciones. Confirmó que ese día se le instruyó agotar su balance de vacaciones y que el 6 de agosto de 2026 compareció a la cita con el Médico Ocupacional, expresando que desde entonces se encuentra agotando vacaciones sin así quererlo.</w:t>
+          <w:color w:val="FF0000"/>
+        </w:rPr>
+        <w:t xml:space="preserve">En cuanto al alcance del acomodo concedido, el empleado puntualizó que la instrucción que recibió fue que Recursos Humanos hablaría con el supervisor interino para identificar dónde podía acomodarlo; que en ese momento se le mencionó el tractor y no el rastrillo; que el trabajo de tractor no era diario; y que, los días en que no había tractor, se le asignaba conducir la guagua para transportar a sus compañeros a las áreas de trabajo y escoltarlos en la vía, sin realizar tareas de carga.</w:t>
       </w:r>
     </w:p>
     <w:p>
@@ -3315,8 +3320,9 @@
           <w:sz w:val="24"/>
           <w:szCs w:val="24"/>
           <w:lang w:val="es-ES"/>
-        </w:rPr>
-        <w:t xml:space="preserve">El empleado indicó que no conocía la especificación de clase del puesto de Trabajador hasta que el Médico Ocupacional se la leyó durante su evaluación. Durante la vista se le mostraron y explicaron las funciones del puesto según dicha especificación y se le entregó copia de la misma.</w:t>
+          <w:color w:val="FF0000"/>
+        </w:rPr>
+        <w:t xml:space="preserve">Sobre los hechos del 3 de agosto de 2026, el empleado confirmó la secuencia de eventos: ese día faltó el compañero que ordinariamente utilizaba el carretón y había poco personal; el supervisor le instruyó tomar el rastrillo y el carretón (“dron”) para recoger basura; el empleado le manifestó que estaba lastimado y que había traído un papel del médico; fue conducido a Servicios Generales y citado a las 11:00 a.m. a la Oficina de Recursos Humanos donde, al planteársele que se estaba negando a trabajar, respondió que no se estaba negando a trabajar, sino que había traído una certificación médica con sus limitaciones. Confirmó que ese día se le instruyó agotar su balance de vacaciones y que el 6 de agosto de 2026 compareció a la cita con el Médico Ocupacional, expresando que desde entonces se encuentra agotando vacaciones sin así quererlo.</w:t>
       </w:r>
     </w:p>
     <w:p>
@@ -3343,8 +3349,9 @@
           <w:sz w:val="24"/>
           <w:szCs w:val="24"/>
           <w:lang w:val="es-ES"/>
-        </w:rPr>
-        <w:t xml:space="preserve">El empleado cuestionó que el Médico Ocupacional fuese contratado por el Municipio y no un médico independiente. Se le explicó que se trata de un facultativo de vasta experiencia que sirve a múltiples municipios y que el referido a una evaluación médica ocupacional es el trámite que dispone la reglamentación aplicable. Asimismo, el empleado admitió que, al recibir la carta, sabía que se trataba de una intención de cesantía.</w:t>
+          <w:color w:val="FF0000"/>
+        </w:rPr>
+        <w:t xml:space="preserve">El empleado indicó que no conocía la especificación de clase del puesto de Trabajador hasta que el Médico Ocupacional se la leyó durante su evaluación. Durante la vista se le mostraron y explicaron las funciones del puesto según dicha especificación y se le entregó copia de la misma.</w:t>
       </w:r>
     </w:p>
     <w:p>
@@ -3363,14 +3370,17 @@
           <w:lang w:val="es-ES"/>
         </w:rPr>
       </w:pPr>
-      <w:r>
-        <w:rPr>
-          <w:rFonts w:ascii="Times New Roman" w:hAnsi="Times New Roman" w:cs="Times New Roman"/>
-          <w:sz w:val="24"/>
-          <w:szCs w:val="24"/>
-          <w:lang w:val="es-ES"/>
-        </w:rPr>
-        <w:t xml:space="preserve">Como alternativas adicionales de acomodo, el empleado planteó: (i) operar un "rolo" (rodillo/compactador) en obras públicas; y (ii) integrarse a la brigada de tractores adscrita a los parques y a Recreación y Deportes, aclarando que no interesaba desplazar a ningún compañero. Sin embargo, el propio empleado reconoció que no puede levantar peso, que ya no existe trabajo diario de tractor por haberse privatizado el mantenimiento de los parques, y que, a pesar de que puede realizar las funciones de conductor, no cuenta con la licencia y categoría requeridas para ocupar dicho puesto.</w:t>
+      <w:proofErr w:type="spellStart"/>
+      <w:proofErr w:type="spellEnd"/>
+      <w:r>
+        <w:rPr>
+          <w:rFonts w:ascii="Times New Roman" w:hAnsi="Times New Roman" w:cs="Times New Roman"/>
+          <w:sz w:val="24"/>
+          <w:szCs w:val="24"/>
+          <w:lang w:val="es-ES"/>
+          <w:color w:val="FF0000"/>
+        </w:rPr>
+        <w:t xml:space="preserve">El empleado cuestionó que el Médico Ocupacional fuese contratado por el Municipio y no un médico independiente. Se le explicó que se trata de un facultativo de vasta experiencia que sirve a múltiples municipios y que el referido a una evaluación médica ocupacional es el trámite que dispone la reglamentación aplicable. Asimismo, el empleado admitió que, al recibir la carta, sabía que se trataba de una intención de cesantía.</w:t>
       </w:r>
     </w:p>
     <w:p>
@@ -3389,14 +3399,60 @@
           <w:lang w:val="es-ES"/>
         </w:rPr>
       </w:pPr>
-      <w:proofErr w:type="spellStart"/>
-      <w:proofErr w:type="spellEnd"/>
-      <w:r>
-        <w:rPr>
-          <w:rFonts w:ascii="Times New Roman" w:hAnsi="Times New Roman" w:cs="Times New Roman"/>
-          <w:sz w:val="24"/>
-          <w:szCs w:val="24"/>
-          <w:lang w:val="es-ES"/>
+      <w:r>
+        <w:rPr>
+          <w:rFonts w:ascii="Times New Roman" w:hAnsi="Times New Roman" w:cs="Times New Roman"/>
+          <w:sz w:val="24"/>
+          <w:szCs w:val="24"/>
+          <w:lang w:val="es-ES"/>
+        </w:rPr>
+        <w:t xml:space="preserve">Como alternativas adicionales de acomodo, el empleado planteó: (i) operar un "rolo" (rodillo/compactador) en obras públicas; y (ii) integrarse a la brigada de tractores adscrita a los parques y a Recreación y Deportes, aclarando que no interesaba desplazar a ningún compañero. Sin embargo, el propio empleado reconoció que no puede levantar peso, que ya no existe trabajo diario de tractor por haberse privatizado el mantenimiento de los parques, </w:t>
+      </w:r>
+      <w:r>
+        <w:rPr>
+          <w:rFonts w:ascii="Times New Roman" w:hAnsi="Times New Roman" w:cs="Times New Roman"/>
+          <w:sz w:val="24"/>
+          <w:szCs w:val="24"/>
+          <w:lang w:val="es-ES"/>
+          <w:color w:val="FF0000"/>
+        </w:rPr>
+        <w:t xml:space="preserve">y que, a pesar de que puede realizar</w:t>
+      </w:r>
+      <w:r>
+        <w:rPr>
+          <w:rFonts w:ascii="Times New Roman" w:hAnsi="Times New Roman" w:cs="Times New Roman"/>
+          <w:sz w:val="24"/>
+          <w:szCs w:val="24"/>
+          <w:lang w:val="es-ES"/>
+        </w:rPr>
+        <w:t xml:space="preserve"> las funciones de conductor, no cuenta con la licencia y categoría requeridas para ocupar dicho puesto.</w:t>
+      </w:r>
+    </w:p>
+    <w:p>
+      <w:pPr>
+        <w:pStyle w:val="ListParagraph"/>
+        <w:numPr>
+          <w:ilvl w:val="0"/>
+          <w:numId w:val="36"/>
+        </w:numPr>
+        <w:spacing w:after="240"/>
+        <w:contextualSpacing w:val="0"/>
+        <w:rPr>
+          <w:rFonts w:ascii="Times New Roman" w:hAnsi="Times New Roman" w:cs="Times New Roman"/>
+          <w:sz w:val="24"/>
+          <w:szCs w:val="24"/>
+          <w:lang w:val="es-ES"/>
+        </w:rPr>
+      </w:pPr>
+      <w:proofErr w:type="spellStart"/>
+      <w:proofErr w:type="spellEnd"/>
+      <w:r>
+        <w:rPr>
+          <w:rFonts w:ascii="Times New Roman" w:hAnsi="Times New Roman" w:cs="Times New Roman"/>
+          <w:sz w:val="24"/>
+          <w:szCs w:val="24"/>
+          <w:lang w:val="es-ES"/>
+          <w:color w:val="FF0000"/>
         </w:rPr>
         <w:t xml:space="preserve">En determinado momento, el empleado expresó interés en recalendarizar la vista para comparecer con abogado y presentar prueba adicional de sus condiciones; no obstante, optó por continuar y expresarse, y la vista prosiguió hasta su conclusión sin que mediara solicitud formal de suspensión o recalendarización.</w:t>
       </w:r>

</xml_diff>

<commit_message>
Añadir en rojo el análisis de los cuatro puestos de conducción/operación considerados para el acomodo
Nueva determinación de hecho y oración de la Conclusión, en fuente roja pendiente de confirmación: el Municipio consideró Conductor de Vehículo Liviano (cat. 4), Conductor de Vehículo Pesado (cat. 8), Operador de Equipo Liviano (cat. 3, que asciende a 4 al transportar pasajeros; por verificar) y Operador de Equipo Pesado (cat. 9); el empleado posee solo categoría 3 y no cumple con ninguno.

Co-Authored-By: Claude Fable 5.1 <noreply@anthropic.com>

Claude-Session: https://claude.ai/code/session_015XTf7YVNkr8YeGhk2dDMDw
</commit_message>
<xml_diff>
--- a/REV2a. Informe de Vista Informal Luis Vélez.docx
+++ b/REV2a. Informe de Vista Informal Luis Vélez.docx
@@ -3426,6 +3426,33 @@
           <w:lang w:val="es-ES"/>
         </w:rPr>
         <w:t xml:space="preserve"> las funciones de conductor, no cuenta con la licencia y categoría requeridas para ocupar dicho puesto.</w:t>
+      </w:r>
+    </w:p>
+    <w:p>
+      <w:pPr>
+        <w:pStyle w:val="ListParagraph"/>
+        <w:numPr>
+          <w:ilvl w:val="0"/>
+          <w:numId w:val="36"/>
+        </w:numPr>
+        <w:spacing w:after="240"/>
+        <w:contextualSpacing w:val="0"/>
+        <w:rPr>
+          <w:rFonts w:ascii="Times New Roman" w:hAnsi="Times New Roman" w:cs="Times New Roman"/>
+          <w:sz w:val="24"/>
+          <w:szCs w:val="24"/>
+          <w:lang w:val="es-ES"/>
+        </w:rPr>
+      </w:pPr>
+      <w:r>
+        <w:rPr>
+          <w:rFonts w:ascii="Times New Roman" w:hAnsi="Times New Roman" w:cs="Times New Roman"/>
+          <w:sz w:val="24"/>
+          <w:szCs w:val="24"/>
+          <w:lang w:val="es-ES"/>
+          <w:color w:val="FF0000"/>
+        </w:rPr>
+        <w:t xml:space="preserve">En la evaluación de las alternativas de acomodo razonable, el Municipio consideró los requisitos de los siguientes cuatro (4) puestos relacionados con las funciones de conducción y operación de equipo planteadas por el empleado: (1) Conductor de Vehículo Liviano de Motor, que requiere licencia de conducir de categoría 4; (2) Conductor de Vehículo Pesado de Motor, que requiere licencia de categoría 8; (3) Operador de Equipo Liviano, que requiere licencia de categoría 3, la cual asciende a categoría 4 cuando se transportan pasajeros (información pendiente de verificación); y (4) Operador de Equipo Pesado, que requiere licencia de categoría 9. El empleado posee únicamente licencia de categoría 3, por lo que no cumple con los requisitos de ninguno de dichos puestos, toda vez que la función que solicita —transportar a sus compañeros— requiere licencia de categoría 4.</w:t>
       </w:r>
     </w:p>
     <w:p>
@@ -5380,39 +5407,22 @@
           <w:rFonts w:ascii="Times New Roman" w:hAnsi="Times New Roman" w:cs="Times New Roman"/>
           <w:lang w:val="es-ES"/>
         </w:rPr>
-        <w:t xml:space="preserve">Como parte de un proceso interactivo, el Municipio concedió al empleado un acomodo razonable, relevándolo del uso del “blower” y del “trimmer” y asignándole la conducción del tractor y funciones de rastrillo. Sin embargo, el propio empleado manifestó que tampoco podía realizar las tareas de rastrillo y carretón, negándose a ejecutarlas. En la vista, el empleado solicitó como acomodo que se le asignara conducir un vehículo de motor (chofer). Sin embargo, dicha función no forma parte de las funciones esenciales de la especificación de clase del puesto de Trabajador y el empleado no cualifica para el puesto de Conductor, ya que dicho puesto exige la licencia de </w:t>
-      </w:r>
-      <w:r>
-        <w:rPr>
-          <w:rFonts w:ascii="Times New Roman" w:hAnsi="Times New Roman" w:cs="Times New Roman"/>
-          <w:highlight w:val="yellow"/>
-          <w:lang w:val="es-ES"/>
-        </w:rPr>
-        <w:t xml:space="preserve">conducir </w:t>
-      </w:r>
-      <w:r>
-        <w:rPr>
-          <w:rFonts w:ascii="Times New Roman" w:hAnsi="Times New Roman" w:cs="Times New Roman"/>
+        <w:t xml:space="preserve">Como parte de un proceso interactivo, el Municipio concedió al empleado un acomodo razonable, relevándolo del uso del “blower” y del “trimmer” y asignándole la conducción del tractor y funciones de rastrillo. Sin embargo, el propio empleado manifestó que tampoco podía realizar las tareas de rastrillo y carretón, negándose a ejecutarlas. En la vista, el empleado solicitó como acomodo que se le asignara conducir un vehículo de motor (chofer). Sin embargo, dicha función no forma parte de las funciones esenciales de la especificación de clase del puesto de Trabajador </w:t>
+      </w:r>
+      <w:r>
+        <w:rPr>
+          <w:rFonts w:ascii="Times New Roman" w:hAnsi="Times New Roman" w:cs="Times New Roman"/>
+          <w:lang w:val="es-ES"/>
           <w:color w:val="FF0000"/>
-          <w:highlight w:val="yellow"/>
-          <w:lang w:val="es-ES"/>
-        </w:rPr>
-        <w:t>(categoría 4)</w:t>
-      </w:r>
-      <w:r>
-        <w:rPr>
-          <w:rFonts w:ascii="Times New Roman" w:hAnsi="Times New Roman" w:cs="Times New Roman"/>
-          <w:highlight w:val="yellow"/>
-          <w:lang w:val="es-ES"/>
-        </w:rPr>
-        <w:t>.</w:t>
-      </w:r>
-      <w:r>
-        <w:rPr>
-          <w:rFonts w:ascii="Times New Roman" w:hAnsi="Times New Roman" w:cs="Times New Roman"/>
-          <w:lang w:val="es-ES"/>
-        </w:rPr>
-        <w:t xml:space="preserve"> Por tanto, es improcedente en derecho dicha solicitud. Las demás alternativas planteadas por el empleado tampoco resultan viables: la operación del tractor o de un “rolo” no constituye trabajo diario disponible —por haberse privatizado el mantenimiento de los parques— y, además, requiere una licencia o categoría de la que el empleado carece, sin que la “Operator Certification” que presentó supla dicho requisito; su integración a la brigada de tractores desplazaría a otro empleado, lo que el propio compareciente indicó no interesar; y las funciones administrativas que el Médico Ocupacional mencionó “if possible” presuponen la existencia de un puesto vacante compatible con sus limitaciones para el cual el empleado cualifique conforme a su preparación académica y experiencia, el cual no existe al presente. A ello se suma que su propio médico primario certificó que no puede permanecer mucho tiempo de pie ni cargar peso mayor de quince (15) libras, y que el empleado admitió en la vista no poder levantar peso alguno.</w:t>
+        </w:rPr>
+        <w:t xml:space="preserve">y el empleado no cualifica para ninguno de los puestos de conducción u operación de equipo considerados por el Municipio —Conductor de Vehículo Liviano de Motor (categoría 4), Conductor de Vehículo Pesado de Motor (categoría 8), Operador de Equipo Liviano (categoría 3, que asciende a categoría 4 al transportar pasajeros) y Operador de Equipo Pesado (categoría 9)—, pues posee únicamente licencia de categoría 3 y la función que solicita, transportar a sus compañeros, requiere licencia de categoría 4. Por tanto, es improcedente en derecho dicha solicitud.</w:t>
+      </w:r>
+      <w:r>
+        <w:rPr>
+          <w:rFonts w:ascii="Times New Roman" w:hAnsi="Times New Roman" w:cs="Times New Roman"/>
+          <w:lang w:val="es-ES"/>
+        </w:rPr>
+        <w:t xml:space="preserve"> Las demás alternativas planteadas por el empleado tampoco resultan viables: la operación del tractor o de un “rolo” no constituye trabajo diario disponible —por haberse privatizado el mantenimiento de los parques— y, además, requiere una licencia o categoría de la que el empleado carece, sin que la “Operator Certification” que presentó supla dicho requisito; su integración a la brigada de tractores desplazaría a otro empleado, lo que el propio compareciente indicó no interesar; y las funciones administrativas que el Médico Ocupacional mencionó “if possible” presuponen la existencia de un puesto vacante compatible con sus limitaciones para el cual el empleado cualifique conforme a su preparación académica y experiencia, el cual no existe al presente. A ello se suma que su propio médico primario certificó que no puede permanecer mucho tiempo de pie ni cargar peso mayor de quince (15) libras, y que el empleado admitió en la vista no poder levantar peso alguno.</w:t>
       </w:r>
     </w:p>
     <w:p>

</xml_diff>

<commit_message>
Corregir en rojo el análisis de las cuatro clases de puesto según las especificaciones de clase 2411, 2413, 2421 y 2423
Se sustituye la premisa no verificada (categoría 3 asciende a 4 por transporte de pasajeros) por los requisitos reales de cada especificación: 2411 exige licencia de Chofer (cat. 4); 2413 y 2423 exigen licencia de vehículos pesados cuya categoría depende del vehículo/equipo (Ley 22-2000); 2421 exige licencia de conductor (cat. 3) y un año de experiencia, requisitos que el empleado sí cumple, por lo que su inviabilidad se fundamenta en el esfuerzo físico fuerte que exige la clase, incompatible con sus limitaciones médicas, y en la inexistencia de vacante y de trabajo diario de tractor. Se corrige la oración de la Conclusión sobre tractor/rolo. Todo en rojo pendiente de aprobación.

Co-Authored-By: Claude Fable 5.1 <noreply@anthropic.com>

Claude-Session: https://claude.ai/code/session_015XTf7YVNkr8YeGhk2dDMDw
</commit_message>
<xml_diff>
--- a/REV2a. Informe de Vista Informal Luis Vélez.docx
+++ b/REV2a. Informe de Vista Informal Luis Vélez.docx
@@ -3452,7 +3452,7 @@
           <w:lang w:val="es-ES"/>
           <w:color w:val="FF0000"/>
         </w:rPr>
-        <w:t xml:space="preserve">En la evaluación de las alternativas de acomodo razonable, el Municipio consideró los requisitos de los siguientes cuatro (4) puestos relacionados con las funciones de conducción y operación de equipo planteadas por el empleado: (1) Conductor de Vehículo Liviano de Motor, que requiere licencia de conducir de categoría 4; (2) Conductor de Vehículo Pesado de Motor, que requiere licencia de categoría 8; (3) Operador de Equipo Liviano, que requiere licencia de categoría 3, la cual asciende a categoría 4 cuando se transportan pasajeros (información pendiente de verificación); y (4) Operador de Equipo Pesado, que requiere licencia de categoría 9. El empleado posee únicamente licencia de categoría 3, por lo que no cumple con los requisitos de ninguno de dichos puestos, toda vez que la función que solicita —transportar a sus compañeros— requiere licencia de categoría 4.</w:t>
+        <w:t xml:space="preserve">En la evaluación de las alternativas de acomodo razonable, el Municipio consideró los requisitos de las siguientes cuatro (4) clases de puesto del Plan de Clasificación de Puestos para el Servicio de Carrera (vigente desde el 1 de enero de 2004), relacionadas con las funciones de conducción y operación de equipo planteadas por el empleado: (1) Conductor(a) de Vehículos Livianos de Motor (clase 2411), que exige poseer licencia vigente de Chofer (categoría 4) expedida por el DTOP y conlleva esfuerzo físico moderado; (2) Conductor(a) de Vehículos Pesados de Motor (clase 2413), que exige licencia vigente de conducir vehículos pesados de motor, cuya categoría depende del tipo de vehículo pesado conforme a la Ley Núm. 22-2000 (categorías 6 a 8), e incluye transportar trabajadores al área de trabajo y colaborar en la carga y descarga de materiales, con esfuerzo físico fuerte; (3) Operador(a) de Equipo Liviano (clase 2421), que exige licencia vigente de conductor (categoría 3) y un (1) año de experiencia en la operación de equipo liviano o en la conducción de vehículos livianos, e incluye operar máquina de cortar grama y realizar trabajos de limpieza de calles, carreteras y aceras y de acondicionamiento de terrenos, con esfuerzo físico fuerte y exposición a riesgos máximos; y (4) Operador(a) de Equipo Pesado (clase 2423), que exige licencia vigente de conducir vehículos pesados de motor, cuya categoría depende del equipo a operar, y un (1) año de experiencia en la operación de equipo pesado, con esfuerzo físico fuerte. El empleado posee únicamente licencia de conductor (categoría 3), por lo que no cumple con el requisito de licencia de las clases 2411, 2413 y 2423, sin que la certificación de operador que presentó sustituya la licencia requerida. En cuanto a la clase 2421, aunque el empleado cumple con los requisitos de licencia y de experiencia, las funciones esenciales de dicha clase exigen esfuerzo físico fuerte y trabajos de limpieza y acondicionamiento incompatibles con las limitaciones certificadas por su médico primario y por el Médico Ocupacional, y no existe un puesto vacante de dicha clase ni trabajo diario de tractor cortagrama, por haberse privatizado el mantenimiento de los parques, según el propio empleado admitió.</w:t>
       </w:r>
     </w:p>
     <w:p>
@@ -5415,14 +5415,29 @@
           <w:lang w:val="es-ES"/>
           <w:color w:val="FF0000"/>
         </w:rPr>
-        <w:t xml:space="preserve">y el empleado no cualifica para ninguno de los puestos de conducción u operación de equipo considerados por el Municipio —Conductor de Vehículo Liviano de Motor (categoría 4), Conductor de Vehículo Pesado de Motor (categoría 8), Operador de Equipo Liviano (categoría 3, que asciende a categoría 4 al transportar pasajeros) y Operador de Equipo Pesado (categoría 9)—, pues posee únicamente licencia de categoría 3 y la función que solicita, transportar a sus compañeros, requiere licencia de categoría 4. Por tanto, es improcedente en derecho dicha solicitud.</w:t>
-      </w:r>
-      <w:r>
-        <w:rPr>
-          <w:rFonts w:ascii="Times New Roman" w:hAnsi="Times New Roman" w:cs="Times New Roman"/>
-          <w:lang w:val="es-ES"/>
-        </w:rPr>
-        <w:t xml:space="preserve"> Las demás alternativas planteadas por el empleado tampoco resultan viables: la operación del tractor o de un “rolo” no constituye trabajo diario disponible —por haberse privatizado el mantenimiento de los parques— y, además, requiere una licencia o categoría de la que el empleado carece, sin que la “Operator Certification” que presentó supla dicho requisito; su integración a la brigada de tractores desplazaría a otro empleado, lo que el propio compareciente indicó no interesar; y las funciones administrativas que el Médico Ocupacional mencionó “if possible” presuponen la existencia de un puesto vacante compatible con sus limitaciones para el cual el empleado cualifique conforme a su preparación académica y experiencia, el cual no existe al presente. A ello se suma que su propio médico primario certificó que no puede permanecer mucho tiempo de pie ni cargar peso mayor de quince (15) libras, y que el empleado admitió en la vista no poder levantar peso alguno.</w:t>
+        <w:t xml:space="preserve">y el empleado no cualifica para las clases de puesto de conducción y operación de equipo consideradas por el Municipio: carece de la licencia de Chofer (categoría 4) que exige la clase Conductor(a) de Vehículos Livianos de Motor —que corresponde a transportar pasajeros en asuntos oficiales— y de la licencia de conducir vehículos pesados de motor que exigen las clases Conductor(a) de Vehículos Pesados de Motor —que corresponde a transportar trabajadores al área de trabajo— y Operador(a) de Equipo Pesado, pues posee únicamente licencia de conductor (categoría 3); y, aunque cumple con los requisitos de licencia y experiencia de la clase Operador(a) de Equipo Liviano, las funciones esenciales de esa clase requieren esfuerzo físico fuerte y trabajos de limpieza y acondicionamiento que sus limitaciones médicas no le permiten realizar, además de que no existe puesto vacante de dicha clase ni trabajo diario de tractor. Por tanto, es improcedente en derecho dicha solicitud.</w:t>
+      </w:r>
+      <w:r>
+        <w:rPr>
+          <w:rFonts w:ascii="Times New Roman" w:hAnsi="Times New Roman" w:cs="Times New Roman"/>
+          <w:lang w:val="es-ES"/>
+        </w:rPr>
+        <w:t xml:space="preserve"> Las demás alternativas planteadas por el empleado tampoco resultan viables: </w:t>
+      </w:r>
+      <w:r>
+        <w:rPr>
+          <w:rFonts w:ascii="Times New Roman" w:hAnsi="Times New Roman" w:cs="Times New Roman"/>
+          <w:lang w:val="es-ES"/>
+          <w:color w:val="FF0000"/>
+        </w:rPr>
+        <w:t xml:space="preserve">la operación del tractor cortagrama no constituye trabajo diario disponible —por haberse privatizado el mantenimiento de los parques— y la operación de un “rolo” requiere licencia de conducir vehículos pesados de motor de la que el empleado carece, sin que la “Operator Certification” que presentó supla dicho requisito;</w:t>
+      </w:r>
+      <w:r>
+        <w:rPr>
+          <w:rFonts w:ascii="Times New Roman" w:hAnsi="Times New Roman" w:cs="Times New Roman"/>
+          <w:lang w:val="es-ES"/>
+        </w:rPr>
+        <w:t xml:space="preserve"> su integración a la brigada de tractores desplazaría a otro empleado, lo que el propio compareciente indicó no interesar; y las funciones administrativas que el Médico Ocupacional mencionó “if possible” presuponen la existencia de un puesto vacante compatible con sus limitaciones para el cual el empleado cualifique conforme a su preparación académica y experiencia, el cual no existe al presente. A ello se suma que su propio médico primario certificó que no puede permanecer mucho tiempo de pie ni cargar peso mayor de quince (15) libras, y que el empleado admitió en la vista no poder levantar peso alguno.</w:t>
       </w:r>
     </w:p>
     <w:p>

</xml_diff>